<commit_message>
Add generated art to the book, and finish it on a Mac
tools/make_art is a Processing sketch that draws the cover, a title-page
picture for each chapter, and eight spot pictures, in the C# book's
line-art style with the Blob as its recurring character.  finish_book.ps1
now places the spot pictures.

finish_book.applescript does finish_book.ps1's steps in Word for Mac, and
build_chapter.lua no longer frames the line art.  The book and meeting PDFs
are rebuilt with the art.

Co-Authored-By: Claude Opus 5.5 (1M context) <noreply@anthropic.com>
</commit_message>
<xml_diff>
--- a/lessons/chapters/tools/book-reference.docx
+++ b/lessons/chapters/tools/book-reference.docx
@@ -1054,6 +1054,26 @@
       <w:color w:val="365F91" w:themeColor="accent1" w:themeShade="BF"/>
     </w:rPr>
   </w:style>
+  <w:style w:type="paragraph" w:customStyle="1" w:styleId="Date">
+    <w:name w:val="Date"/>
+    <w:basedOn w:val="Normal"/>
+    <w:next w:val="BodyText"/>
+    <w:qFormat/>
+    <w:pPr>
+      <w:pBdr>
+        <w:bottom w:val="single" w:sz="8" w:space="6" w:color="1F4E79"/>
+      </w:pBdr>
+      <w:spacing w:before="0" w:after="240"/>
+    </w:pPr>
+    <w:rPr>
+      <w:b/>
+      <w:caps/>
+      <w:color w:val="5B6B7A"/>
+      <w:spacing w:val="10"/>
+      <w:sz w:val="18"/>
+      <w:szCs w:val="18"/>
+    </w:rPr>
+  </w:style>
   <w:style w:type="paragraph" w:customStyle="1" w:styleId="SourceCode">
     <w:name w:val="Source Code"/>
     <w:basedOn w:val="Normal"/>
@@ -1071,6 +1091,84 @@
       <w:ind w:left="100" w:right="100"/>
     </w:pPr>
   </w:style>
+  <w:style w:type="character" w:customStyle="1" w:styleId="VerbatimChar">
+    <w:name w:val="Verbatim Char"/>
+    <w:basedOn w:val="BodyTextChar"/>
+    <w:rPr>
+      <w:rFonts w:ascii="Consolas" w:hAnsi="Consolas" w:cs="Consolas"/>
+      <w:color w:val="1A4D80"/>
+      <w:sz w:val="19"/>
+      <w:szCs w:val="19"/>
+    </w:rPr>
+  </w:style>
+  <w:style w:type="paragraph" w:customStyle="1" w:styleId="BookCover">
+    <w:name w:val="Book Cover"/>
+    <w:basedOn w:val="Normal"/>
+    <w:pPr>
+      <w:jc w:val="center"/>
+      <w:spacing w:before="720" w:after="360"/>
+    </w:pPr>
+  </w:style>
+  <w:style w:type="paragraph" w:customStyle="1" w:styleId="ScreenshotCaption">
+    <w:name w:val="Screenshot Caption"/>
+    <w:basedOn w:val="Normal"/>
+    <w:next w:val="BodyText"/>
+    <w:pPr>
+      <w:jc w:val="center"/>
+      <w:spacing w:before="0" w:after="240"/>
+    </w:pPr>
+    <w:rPr>
+      <w:i/>
+      <w:color w:val="5B6B7A"/>
+      <w:sz w:val="19"/>
+      <w:szCs w:val="19"/>
+    </w:rPr>
+  </w:style>
+  <w:style w:type="paragraph" w:styleId="Subtitle">
+    <w:name w:val="Subtitle"/>
+    <w:basedOn w:val="Normal"/>
+    <w:next w:val="BodyText"/>
+    <w:qFormat/>
+    <w:pPr>
+      <w:spacing w:before="0" w:after="60"/>
+    </w:pPr>
+    <w:rPr>
+      <w:i/>
+      <w:color w:val="2D3B47"/>
+      <w:sz w:val="28"/>
+      <w:szCs w:val="28"/>
+    </w:rPr>
+  </w:style>
+  <w:style w:type="paragraph" w:customStyle="1" w:styleId="Screenshot">
+    <w:name w:val="Screenshot"/>
+    <w:basedOn w:val="Normal"/>
+    <w:next w:val="ScreenshotCaption"/>
+    <w:pPr>
+      <w:keepNext/>
+      <w:jc w:val="center"/>
+      <w:spacing w:before="160" w:after="40"/>
+    </w:pPr>
+  </w:style>
+  <w:style w:type="character" w:customStyle="1" w:styleId="HeadingCode">
+    <w:name w:val="Heading Code"/>
+    <w:basedOn w:val="DefaultParagraphFont"/>
+    <w:rPr>
+      <w:rFonts w:ascii="Consolas" w:hAnsi="Consolas" w:cs="Consolas"/>
+    </w:rPr>
+  </w:style>
+  <w:style w:type="paragraph" w:customStyle="1" w:styleId="BookByline">
+    <w:name w:val="Book Byline"/>
+    <w:basedOn w:val="Normal"/>
+    <w:pPr>
+      <w:jc w:val="center"/>
+      <w:spacing w:before="0" w:after="60"/>
+    </w:pPr>
+    <w:rPr>
+      <w:color w:val="5B6B7A"/>
+      <w:sz w:val="24"/>
+      <w:szCs w:val="24"/>
+    </w:rPr>
+  </w:style>
   <w:style w:type="paragraph" w:styleId="Title">
     <w:name w:val="Title"/>
     <w:basedOn w:val="Normal"/>
@@ -1086,6 +1184,20 @@
       <w:szCs w:val="48"/>
     </w:rPr>
   </w:style>
+  <w:style w:type="paragraph" w:customStyle="1" w:styleId="BookSubtitle">
+    <w:name w:val="Book Subtitle"/>
+    <w:basedOn w:val="Normal"/>
+    <w:pPr>
+      <w:jc w:val="center"/>
+      <w:spacing w:before="0" w:after="480"/>
+    </w:pPr>
+    <w:rPr>
+      <w:i/>
+      <w:color w:val="2D3B47"/>
+      <w:sz w:val="30"/>
+      <w:szCs w:val="30"/>
+    </w:rPr>
+  </w:style>
   <w:style w:type="paragraph" w:customStyle="1" w:styleId="BookTitle">
     <w:name w:val="Book Title"/>
     <w:basedOn w:val="Normal"/>
@@ -1099,6 +1211,13 @@
       <w:sz w:val="64"/>
       <w:szCs w:val="64"/>
     </w:rPr>
+  </w:style>
+  <w:style w:type="paragraph" w:customStyle="1" w:styleId="KeepWithNext">
+    <w:name w:val="Keep With Next"/>
+    <w:basedOn w:val="BodyText"/>
+    <w:pPr>
+      <w:keepNext/>
+    </w:pPr>
   </w:style>
   <w:style w:type="table" w:default="1" w:styleId="Table">
     <w:name w:val="Table"/>
@@ -1133,125 +1252,6 @@
         <w:shd w:val="clear" w:color="auto" w:fill="E5EDF5"/>
       </w:tcPr>
     </w:tblStylePr>
-  </w:style>
-  <w:style w:type="paragraph" w:customStyle="1" w:styleId="Date">
-    <w:name w:val="Date"/>
-    <w:basedOn w:val="Normal"/>
-    <w:next w:val="BodyText"/>
-    <w:qFormat/>
-    <w:pPr>
-      <w:pBdr>
-        <w:bottom w:val="single" w:sz="8" w:space="6" w:color="1F4E79"/>
-      </w:pBdr>
-      <w:spacing w:before="0" w:after="240"/>
-    </w:pPr>
-    <w:rPr>
-      <w:b/>
-      <w:caps/>
-      <w:color w:val="5B6B7A"/>
-      <w:spacing w:val="10"/>
-      <w:sz w:val="18"/>
-      <w:szCs w:val="18"/>
-    </w:rPr>
-  </w:style>
-  <w:style w:type="paragraph" w:customStyle="1" w:styleId="KeepWithNext">
-    <w:name w:val="Keep With Next"/>
-    <w:basedOn w:val="BodyText"/>
-    <w:pPr>
-      <w:keepNext/>
-    </w:pPr>
-  </w:style>
-  <w:style w:type="character" w:customStyle="1" w:styleId="HeadingCode">
-    <w:name w:val="Heading Code"/>
-    <w:basedOn w:val="DefaultParagraphFont"/>
-    <w:rPr>
-      <w:rFonts w:ascii="Consolas" w:hAnsi="Consolas" w:cs="Consolas"/>
-    </w:rPr>
-  </w:style>
-  <w:style w:type="character" w:customStyle="1" w:styleId="VerbatimChar">
-    <w:name w:val="Verbatim Char"/>
-    <w:basedOn w:val="BodyTextChar"/>
-    <w:rPr>
-      <w:rFonts w:ascii="Consolas" w:hAnsi="Consolas" w:cs="Consolas"/>
-      <w:color w:val="1A4D80"/>
-      <w:sz w:val="19"/>
-      <w:szCs w:val="19"/>
-    </w:rPr>
-  </w:style>
-  <w:style w:type="paragraph" w:customStyle="1" w:styleId="BookByline">
-    <w:name w:val="Book Byline"/>
-    <w:basedOn w:val="Normal"/>
-    <w:pPr>
-      <w:jc w:val="center"/>
-      <w:spacing w:before="0" w:after="60"/>
-    </w:pPr>
-    <w:rPr>
-      <w:color w:val="5B6B7A"/>
-      <w:sz w:val="24"/>
-      <w:szCs w:val="24"/>
-    </w:rPr>
-  </w:style>
-  <w:style w:type="paragraph" w:customStyle="1" w:styleId="ScreenshotCaption">
-    <w:name w:val="Screenshot Caption"/>
-    <w:basedOn w:val="Normal"/>
-    <w:next w:val="BodyText"/>
-    <w:pPr>
-      <w:jc w:val="center"/>
-      <w:spacing w:before="0" w:after="240"/>
-    </w:pPr>
-    <w:rPr>
-      <w:i/>
-      <w:color w:val="5B6B7A"/>
-      <w:sz w:val="19"/>
-      <w:szCs w:val="19"/>
-    </w:rPr>
-  </w:style>
-  <w:style w:type="paragraph" w:customStyle="1" w:styleId="BookCover">
-    <w:name w:val="Book Cover"/>
-    <w:basedOn w:val="Normal"/>
-    <w:pPr>
-      <w:jc w:val="center"/>
-      <w:spacing w:before="720" w:after="360"/>
-    </w:pPr>
-  </w:style>
-  <w:style w:type="paragraph" w:styleId="Subtitle">
-    <w:name w:val="Subtitle"/>
-    <w:basedOn w:val="Normal"/>
-    <w:next w:val="BodyText"/>
-    <w:qFormat/>
-    <w:pPr>
-      <w:spacing w:before="0" w:after="60"/>
-    </w:pPr>
-    <w:rPr>
-      <w:i/>
-      <w:color w:val="2D3B47"/>
-      <w:sz w:val="28"/>
-      <w:szCs w:val="28"/>
-    </w:rPr>
-  </w:style>
-  <w:style w:type="paragraph" w:customStyle="1" w:styleId="BookSubtitle">
-    <w:name w:val="Book Subtitle"/>
-    <w:basedOn w:val="Normal"/>
-    <w:pPr>
-      <w:jc w:val="center"/>
-      <w:spacing w:before="0" w:after="480"/>
-    </w:pPr>
-    <w:rPr>
-      <w:i/>
-      <w:color w:val="2D3B47"/>
-      <w:sz w:val="30"/>
-      <w:szCs w:val="30"/>
-    </w:rPr>
-  </w:style>
-  <w:style w:type="paragraph" w:customStyle="1" w:styleId="Screenshot">
-    <w:name w:val="Screenshot"/>
-    <w:basedOn w:val="Normal"/>
-    <w:next w:val="ScreenshotCaption"/>
-    <w:pPr>
-      <w:keepNext/>
-      <w:jc w:val="center"/>
-      <w:spacing w:before="160" w:after="40"/>
-    </w:pPr>
   </w:style>
 </w:styles>
 </file>

</xml_diff>